<commit_message>
upload Word for vaetchanan
</commit_message>
<xml_diff>
--- a/public/data/bulletins/5786/vaetchanan.docx
+++ b/public/data/bulletins/5786/vaetchanan.docx
@@ -5,51 +5,36 @@
     <w:p>
       <w:pPr>
         <w:pStyle w:val="heading 1"/>
-        <w:rPr>
-          <w:lang w:val="he-IL" w:bidi="he-IL"/>
+        <w:bidi w:val="1"/>
+        <w:ind w:left="0" w:right="0" w:firstLine="0"/>
+        <w:jc w:val="both"/>
+        <w:rPr>
+          <w:rtl w:val="1"/>
         </w:rPr>
       </w:pPr>
       <w:r>
         <w:rPr>
           <w:rFonts w:ascii="Arial Unicode MS" w:cs="PFT_Frank" w:hAnsi="Arial Unicode MS" w:eastAsia="Arial Unicode MS" w:hint="cs"/>
           <w:rtl w:val="1"/>
-        </w:rPr>
-        <w:t>להתנחם</w:t>
-      </w:r>
-      <w:r>
-        <w:rPr>
-          <w:rFonts w:ascii="PFT_Frank" w:cs="Arial Unicode MS" w:hAnsi="PFT_Frank"/>
-          <w:rtl w:val="1"/>
-        </w:rPr>
-        <w:t xml:space="preserve">: </w:t>
-      </w:r>
-      <w:r>
-        <w:rPr>
-          <w:rFonts w:ascii="Arial Unicode MS" w:cs="PFT_Frank" w:hAnsi="Arial Unicode MS" w:eastAsia="Arial Unicode MS" w:hint="cs"/>
-          <w:rtl w:val="1"/>
-        </w:rPr>
-        <w:t>להפסיק לדאוג</w:t>
-      </w:r>
-      <w:r>
-        <w:rPr>
-          <w:rFonts w:ascii="PFT_Frank" w:cs="Arial Unicode MS" w:hAnsi="PFT_Frank"/>
-          <w:rtl w:val="1"/>
-        </w:rPr>
-        <w:t xml:space="preserve">. </w:t>
-      </w:r>
-      <w:r>
-        <w:rPr>
-          <w:rFonts w:ascii="Arial Unicode MS" w:cs="PFT_Frank" w:hAnsi="Arial Unicode MS" w:eastAsia="Arial Unicode MS" w:hint="cs"/>
-          <w:rtl w:val="1"/>
-        </w:rPr>
-        <w:t>האומנם</w:t>
-      </w:r>
-      <w:r>
-        <w:rPr>
-          <w:rFonts w:ascii="PFT_Frank" w:cs="Arial Unicode MS" w:hAnsi="PFT_Frank"/>
-          <w:rtl w:val="1"/>
-        </w:rPr>
-        <w:t>?</w:t>
+          <w:lang w:val="he-IL" w:bidi="he-IL"/>
+        </w:rPr>
+        <w:t xml:space="preserve">שבת נחמו </w:t>
+      </w:r>
+      <w:r>
+        <w:rPr>
+          <w:rFonts w:ascii="PFT_Frank" w:hAnsi="PFT_Frank"/>
+          <w:rtl w:val="1"/>
+          <w:lang w:val="he-IL" w:bidi="he-IL"/>
+        </w:rPr>
+        <w:t xml:space="preserve">- </w:t>
+      </w:r>
+      <w:r>
+        <w:rPr>
+          <w:rFonts w:ascii="Arial Unicode MS" w:cs="PFT_Frank" w:hAnsi="Arial Unicode MS" w:eastAsia="Arial Unicode MS" w:hint="cs"/>
+          <w:rtl w:val="1"/>
+          <w:lang w:val="he-IL" w:bidi="he-IL"/>
+        </w:rPr>
+        <w:t>לא נפסיק לדאוג</w:t>
       </w:r>
     </w:p>
     <w:p>

</xml_diff>